<commit_message>
Update manuscript with computational benchmarking and supplementary table
</commit_message>
<xml_diff>
--- a/manuscript/custom-reference-doc.docx
+++ b/manuscript/custom-reference-doc.docx
@@ -85,6 +85,8 @@
     <w:p>
       <w:pPr>
         <w:pStyle w:val="Heading5"/>
+        <w:spacing w:line="360" w:lineRule="auto"/>
+        <w:jc w:val="both"/>
       </w:pPr>
       <w:bookmarkStart w:id="4" w:name="heading-5"/>
       <w:r>
@@ -125,6 +127,8 @@
     <w:p>
       <w:pPr>
         <w:pStyle w:val="Heading9"/>
+        <w:spacing w:line="360" w:lineRule="auto"/>
+        <w:jc w:val="both"/>
       </w:pPr>
       <w:bookmarkStart w:id="8" w:name="heading-9"/>
       <w:r>
@@ -161,19 +165,7 @@
           <w:rPr>
             <w:rStyle w:val="Hyperlink"/>
           </w:rPr>
-          <w:t xml:space="preserve"> H</w:t>
-        </w:r>
-        <w:r>
-          <w:rPr>
-            <w:rStyle w:val="Hyperlink"/>
-          </w:rPr>
-          <w:t>y</w:t>
-        </w:r>
-        <w:r>
-          <w:rPr>
-            <w:rStyle w:val="Hyperlink"/>
-          </w:rPr>
-          <w:t xml:space="preserve">perlink </w:t>
+          <w:t xml:space="preserve"> Hyperlink </w:t>
         </w:r>
       </w:hyperlink>
       <w:r>
@@ -992,9 +984,10 @@
     <w:name w:val="Body Text"/>
     <w:basedOn w:val="Normal"/>
     <w:qFormat/>
-    <w:rsid w:val="00F34809"/>
-    <w:pPr>
-      <w:spacing w:before="180" w:after="180"/>
+    <w:rsid w:val="00AB7872"/>
+    <w:pPr>
+      <w:spacing w:before="240" w:after="240" w:line="360" w:lineRule="auto"/>
+      <w:jc w:val="both"/>
     </w:pPr>
   </w:style>
   <w:style w:type="paragraph" w:customStyle="1" w:styleId="FirstParagraph">
@@ -1003,17 +996,15 @@
     <w:next w:val="BodyText"/>
     <w:qFormat/>
     <w:rsid w:val="0039397B"/>
-    <w:pPr>
-      <w:spacing w:line="360" w:lineRule="auto"/>
-      <w:jc w:val="both"/>
-    </w:pPr>
   </w:style>
   <w:style w:type="paragraph" w:customStyle="1" w:styleId="Compact">
     <w:name w:val="Compact"/>
     <w:basedOn w:val="BodyText"/>
     <w:qFormat/>
+    <w:rsid w:val="00317332"/>
     <w:pPr>
       <w:spacing w:before="36" w:after="36"/>
+      <w:jc w:val="left"/>
     </w:pPr>
   </w:style>
   <w:style w:type="paragraph" w:styleId="Title">

</xml_diff>